<commit_message>
Add RLS security migration and update build delta doc
- supabase-rls-migration.sql: enables RLS on all 21 public tables with
  least-privilege policies (TO authenticated, SELECT auth.uid() pattern)
- supabase-rls-fix-recursion.sql: fixes self-referential recursion in
  group_members SELECT policy via SECURITY DEFINER helper function
- BuzzMeIn-BuildDelta.docx: logs RLS decisions as section 13

Co-Authored-By: Claude Sonnet 4.6 <noreply@anthropic.com>
</commit_message>
<xml_diff>
--- a/docs/BuzzMeIn-BuildDelta.docx
+++ b/docs/BuzzMeIn-BuildDelta.docx
@@ -1431,6 +1431,190 @@
       </w:pPr>
       <w:r>
         <w:t xml:space="preserve">list_items.upvotes integer column — replaced by list_item_upvotes table (column may still exist but is no longer used)</w:t>
+      </w:r>
+    </w:p>
+    <w:p>
+      <w:pPr>
+        <w:spacing w:after="200"/>
+      </w:pPr>
+      <w:r>
+        <w:t xml:space="preserve"/>
+      </w:r>
+    </w:p>
+    <w:p>
+      <w:pPr>
+        <w:pStyle w:val="Heading1"/>
+      </w:pPr>
+      <w:r>
+        <w:t xml:space="preserve">13. Database Security — Row Level Security (RLS)</w:t>
+      </w:r>
+    </w:p>
+    <w:p>
+      <w:pPr>
+        <w:pStyle w:val="Heading2"/>
+      </w:pPr>
+      <w:r>
+        <w:t xml:space="preserve">Original plan</w:t>
+      </w:r>
+    </w:p>
+    <w:p>
+      <w:pPr>
+        <w:spacing w:after="120"/>
+      </w:pPr>
+      <w:r>
+        <w:t xml:space="preserve">RLS was not addressed in the original product brief. All tables were created without row level security enabled, leaving data protected only by Supabase’s default table-level grants.</w:t>
+      </w:r>
+    </w:p>
+    <w:p>
+      <w:pPr>
+        <w:pStyle w:val="Heading2"/>
+      </w:pPr>
+      <w:r>
+        <w:t xml:space="preserve">What changed</w:t>
+      </w:r>
+    </w:p>
+    <w:p>
+      <w:pPr>
+        <w:spacing w:after="120"/>
+      </w:pPr>
+      <w:r>
+        <w:t xml:space="preserve">Full RLS was implemented across all 22 public tables. Two SQL migration scripts were created and run against the production database:</w:t>
+      </w:r>
+    </w:p>
+    <w:p>
+      <w:pPr>
+        <w:pStyle w:val="ListParagraph"/>
+        <w:numPr>
+          <w:ilvl w:val="0"/>
+          <w:numId w:val="2"/>
+        </w:numPr>
+      </w:pPr>
+      <w:r>
+        <w:rPr>
+          <w:b/>
+        </w:rPr>
+        <w:t xml:space="preserve">supabase-rls-migration.sql</w:t>
+      </w:r>
+      <w:r>
+        <w:t xml:space="preserve"> — enables RLS on all 21 tables and adds least-privilege policies for each.</w:t>
+      </w:r>
+    </w:p>
+    <w:p>
+      <w:pPr>
+        <w:pStyle w:val="ListParagraph"/>
+        <w:numPr>
+          <w:ilvl w:val="0"/>
+          <w:numId w:val="2"/>
+        </w:numPr>
+      </w:pPr>
+      <w:r>
+        <w:rPr>
+          <w:b/>
+        </w:rPr>
+        <w:t xml:space="preserve">supabase-rls-fix-recursion.sql</w:t>
+      </w:r>
+      <w:r>
+        <w:t xml:space="preserve"> — fixes a self-referential recursion issue in the group_members SELECT policy that caused all data to disappear after the initial migration. Fixed using a SECURITY DEFINER function public.is_group_member(gid uuid) that bypasses RLS for the membership check.</w:t>
+      </w:r>
+    </w:p>
+    <w:p>
+      <w:pPr>
+        <w:pStyle w:val="Heading2"/>
+      </w:pPr>
+      <w:r>
+        <w:t xml:space="preserve">Policy design decisions</w:t>
+      </w:r>
+    </w:p>
+    <w:p>
+      <w:pPr>
+        <w:pStyle w:val="ListParagraph"/>
+        <w:numPr>
+          <w:ilvl w:val="0"/>
+          <w:numId w:val="2"/>
+        </w:numPr>
+      </w:pPr>
+      <w:r>
+        <w:t xml:space="preserve">groups INSERT uses WITH CHECK (true) intentionally — the groups table has no created_by column by design; ownership is tracked entirely through group_members.role. The TO authenticated role restriction is the real security gate.</w:t>
+      </w:r>
+    </w:p>
+    <w:p>
+      <w:pPr>
+        <w:pStyle w:val="ListParagraph"/>
+        <w:numPr>
+          <w:ilvl w:val="0"/>
+          <w:numId w:val="2"/>
+        </w:numPr>
+      </w:pPr>
+      <w:r>
+        <w:t xml:space="preserve">guest_passes restricted to group admins only (not regular members) to protect the sensitive token column.</w:t>
+      </w:r>
+    </w:p>
+    <w:p>
+      <w:pPr>
+        <w:pStyle w:val="ListParagraph"/>
+        <w:numPr>
+          <w:ilvl w:val="0"/>
+          <w:numId w:val="2"/>
+        </w:numPr>
+      </w:pPr>
+      <w:r>
+        <w:t xml:space="preserve">users DELETE explicitly blocked with USING (false) to prevent accidental row deletion via the API; account deletion goes through a server-side function with service_role.</w:t>
+      </w:r>
+    </w:p>
+    <w:p>
+      <w:pPr>
+        <w:pStyle w:val="ListParagraph"/>
+        <w:numPr>
+          <w:ilvl w:val="0"/>
+          <w:numId w:val="2"/>
+        </w:numPr>
+      </w:pPr>
+      <w:r>
+        <w:t xml:space="preserve">waitlist replaced an overly permissive WITH CHECK (true) for anon with WITH CHECK (email IS NOT NULL AND email &lt;&gt; ‘‘). No SELECT policy for anon/authenticated — only service_role can read the list.</w:t>
+      </w:r>
+    </w:p>
+    <w:p>
+      <w:pPr>
+        <w:pStyle w:val="ListParagraph"/>
+        <w:numPr>
+          <w:ilvl w:val="0"/>
+          <w:numId w:val="2"/>
+        </w:numPr>
+      </w:pPr>
+      <w:r>
+        <w:t xml:space="preserve">All policies use (SELECT auth.uid()) instead of auth.uid() for per-query evaluation performance, and are scoped TO authenticated unless explicitly anon.</w:t>
+      </w:r>
+    </w:p>
+    <w:p>
+      <w:pPr>
+        <w:pStyle w:val="Heading2"/>
+      </w:pPr>
+      <w:r>
+        <w:t xml:space="preserve">Known remaining warnings (accepted)</w:t>
+      </w:r>
+    </w:p>
+    <w:p>
+      <w:pPr>
+        <w:pStyle w:val="ListParagraph"/>
+        <w:numPr>
+          <w:ilvl w:val="0"/>
+          <w:numId w:val="2"/>
+        </w:numPr>
+      </w:pPr>
+      <w:r>
+        <w:t xml:space="preserve">groups INSERT WITH CHECK (true) — intentional, no created_by column by design.</w:t>
+      </w:r>
+    </w:p>
+    <w:p>
+      <w:pPr>
+        <w:pStyle w:val="ListParagraph"/>
+        <w:numPr>
+          <w:ilvl w:val="0"/>
+          <w:numId w:val="2"/>
+        </w:numPr>
+      </w:pPr>
+      <w:r>
+        <w:t xml:space="preserve">Compromised password protection — requires Supabase paid plan upgrade.</w:t>
       </w:r>
     </w:p>
     <w:p>

</xml_diff>